<commit_message>
Add home-lab skills to site, JSON-LD and PDF resume (v2.16.2)
Technical Skills:
- AI/ML Research: RAG, Open WebUI
- Tools: Docker, ZFS, Sanoid/Syncoid
- Platforms: Unraid

JSON-LD knowsAbout gains the same six items, with RAG spelled out as
"Retrieval-Augmented Generation (RAG)" to match the list's style.
Finished work only; nothing from the home-lab card's "Next:" line.

Resume files replaced with versions dated 2026-10-05:
- docs/Carl_Lochstampfor_Resume.pdf, exported 2026-10-05 (the PDF's
  internal creation date reads 2026-10-05)
- _source/Carl_Lochstampfor_Resume.docx, the matching source, saved
  2026-10-05. Its internal "modified" property still reads 2026-09-15;
  that value is stale and does not date the content.

Both reflect the skill additions above and add the self-hosted research
NAS project entry. The PDF text was verified against the .docx.

Bump e-Resume label to v2.16.2.
</commit_message>
<xml_diff>
--- a/_source/Carl_Lochstampfor_Resume.docx
+++ b/_source/Carl_Lochstampfor_Resume.docx
@@ -1,6 +1,6 @@
 
 <file path=word/document.xml><?xml version="1.0" encoding="utf-8"?>
-<w:document xmlns:wpc="http://schemas.microsoft.com/office/word/2010/wordprocessingCanvas" xmlns:cx="http://schemas.microsoft.com/office/drawing/2014/chartex" xmlns:cx1="http://schemas.microsoft.com/office/drawing/2015/9/8/chartex" xmlns:cx2="http://schemas.microsoft.com/office/drawing/2015/10/21/chartex" xmlns:cx3="http://schemas.microsoft.com/office/drawing/2016/5/9/chartex" xmlns:cx4="http://schemas.microsoft.com/office/drawing/2016/5/10/chartex" xmlns:cx5="http://schemas.microsoft.com/office/drawing/2016/5/11/chartex" xmlns:cx6="http://schemas.microsoft.com/office/drawing/2016/5/12/chartex" xmlns:cx7="http://schemas.microsoft.com/office/drawing/2016/5/13/chartex" xmlns:cx8="http://schemas.microsoft.com/office/drawing/2016/5/14/chartex" xmlns:mc="http://schemas.openxmlformats.org/markup-compatibility/2006" xmlns:aink="http://schemas.microsoft.com/office/drawing/2016/ink" xmlns:am3d="http://schemas.microsoft.com/office/drawing/2017/model3d" xmlns:o="urn:schemas-microsoft-com:office:office" xmlns:oel="http://schemas.microsoft.com/office/2019/extlst" xmlns:r="http://schemas.openxmlformats.org/officeDocument/2006/relationships" xmlns:m="http://schemas.openxmlformats.org/officeDocument/2006/math" xmlns:v="urn:schemas-microsoft-com:vml" xmlns:wp14="http://schemas.microsoft.com/office/word/2010/wordprocessingDrawing" xmlns:wp="http://schemas.openxmlformats.org/drawingml/2006/wordprocessingDrawing" xmlns:w10="urn:schemas-microsoft-com:office:word" xmlns:w="http://schemas.openxmlformats.org/wordprocessingml/2006/main" xmlns:w14="http://schemas.microsoft.com/office/word/2010/wordml" xmlns:w15="http://schemas.microsoft.com/office/word/2012/wordml" xmlns:w16cex="http://schemas.microsoft.com/office/word/2018/wordml/cex" xmlns:w16cid="http://schemas.microsoft.com/office/word/2016/wordml/cid" xmlns:w16="http://schemas.microsoft.com/office/word/2018/wordml" xmlns:w16du="http://schemas.microsoft.com/office/word/2023/wordml/word16du" xmlns:w16sdtdh="http://schemas.microsoft.com/office/word/2020/wordml/sdtdatahash" xmlns:w16sdtfl="http://schemas.microsoft.com/office/word/2024/wordml/sdtformatlock" xmlns:w16se="http://schemas.microsoft.com/office/word/2015/wordml/symex" xmlns:wpg="http://schemas.microsoft.com/office/word/2010/wordprocessingGroup" xmlns:wpi="http://schemas.microsoft.com/office/word/2010/wordprocessingInk" xmlns:wne="http://schemas.microsoft.com/office/word/2006/wordml" xmlns:wps="http://schemas.microsoft.com/office/word/2010/wordprocessingShape" mc:Ignorable="w14 w15 w16se w16cid w16 w16cex w16sdtdh w16sdtfl w16du wp14">
+<w:document xmlns:wpc="http://schemas.microsoft.com/office/word/2010/wordprocessingCanvas" xmlns:cx="http://schemas.microsoft.com/office/drawing/2014/chartex" xmlns:cx1="http://schemas.microsoft.com/office/drawing/2015/9/8/chartex" xmlns:cx2="http://schemas.microsoft.com/office/drawing/2015/10/21/chartex" xmlns:cx3="http://schemas.microsoft.com/office/drawing/2016/5/9/chartex" xmlns:cx4="http://schemas.microsoft.com/office/drawing/2016/5/10/chartex" xmlns:cx5="http://schemas.microsoft.com/office/drawing/2016/5/11/chartex" xmlns:cx6="http://schemas.microsoft.com/office/drawing/2016/5/12/chartex" xmlns:cx7="http://schemas.microsoft.com/office/drawing/2016/5/13/chartex" xmlns:cx8="http://schemas.microsoft.com/office/drawing/2016/5/14/chartex" xmlns:mc="http://schemas.openxmlformats.org/markup-compatibility/2006" xmlns:aink="http://schemas.microsoft.com/office/drawing/2016/ink" xmlns:am3d="http://schemas.microsoft.com/office/drawing/2017/model3d" xmlns:o="urn:schemas-microsoft-com:office:office" xmlns:oel="http://schemas.microsoft.com/office/2019/extlst" xmlns:r="http://schemas.openxmlformats.org/officeDocument/2006/relationships" xmlns:m="http://schemas.openxmlformats.org/officeDocument/2006/math" xmlns:v="urn:schemas-microsoft-com:vml" xmlns:wp14="http://schemas.microsoft.com/office/word/2010/wordprocessingDrawing" xmlns:wp="http://schemas.openxmlformats.org/drawingml/2006/wordprocessingDrawing" xmlns:w10="urn:schemas-microsoft-com:office:word" xmlns:w="http://schemas.openxmlformats.org/wordprocessingml/2006/main" xmlns:w14="http://schemas.microsoft.com/office/word/2010/wordml" xmlns:w15="http://schemas.microsoft.com/office/word/2012/wordml" xmlns:w16cei="http://schemas.microsoft.com/office/word/2026/wordml/cei" xmlns:w16cex="http://schemas.microsoft.com/office/word/2018/wordml/cex" xmlns:w16cid="http://schemas.microsoft.com/office/word/2016/wordml/cid" xmlns:w16="http://schemas.microsoft.com/office/word/2018/wordml" xmlns:w16du="http://schemas.microsoft.com/office/word/2023/wordml/word16du" xmlns:w16sdtdh="http://schemas.microsoft.com/office/word/2020/wordml/sdtdatahash" xmlns:w16sdtfl="http://schemas.microsoft.com/office/word/2024/wordml/sdtformatlock" xmlns:w16se="http://schemas.microsoft.com/office/word/2015/wordml/symex" xmlns:wpg="http://schemas.microsoft.com/office/word/2010/wordprocessingGroup" xmlns:wpi="http://schemas.microsoft.com/office/word/2010/wordprocessingInk" xmlns:wne="http://schemas.microsoft.com/office/word/2006/wordml" xmlns:wps="http://schemas.microsoft.com/office/word/2010/wordprocessingShape" mc:Ignorable="w14 w15 w16se w16cid w16 w16cex w16sdtdh w16sdtfl w16du wp14">
   <w:body>
     <w:p>
       <w:pPr>
@@ -27,19 +27,6 @@
         <w:jc w:val="center"/>
       </w:pPr>
       <w:hyperlink r:id="rId5" w:history="1">
-        <w:r>
-          <w:rPr>
-            <w:rStyle w:val="Hyperlink"/>
-            <w:sz w:val="20"/>
-            <w:szCs w:val="20"/>
-          </w:rPr>
-          <w:t>cloch001@odu.edu</w:t>
-        </w:r>
-      </w:hyperlink>
-      <w:r>
-        <w:t xml:space="preserve"> | </w:t>
-      </w:r>
-      <w:hyperlink r:id="rId6" w:history="1">
         <w:r>
           <w:rPr>
             <w:rStyle w:val="Hyperlink"/>
@@ -57,7 +44,7 @@
         </w:rPr>
         <w:t xml:space="preserve"> | </w:t>
       </w:r>
-      <w:hyperlink r:id="rId7" w:history="1">
+      <w:hyperlink r:id="rId6" w:history="1">
         <w:r>
           <w:rPr>
             <w:rStyle w:val="Hyperlink"/>
@@ -75,7 +62,7 @@
         </w:rPr>
         <w:t xml:space="preserve"> | </w:t>
       </w:r>
-      <w:hyperlink r:id="rId8" w:history="1">
+      <w:hyperlink r:id="rId7" w:history="1">
         <w:r>
           <w:rPr>
             <w:rStyle w:val="Hyperlink"/>
@@ -93,7 +80,7 @@
         </w:rPr>
         <w:t xml:space="preserve"> | </w:t>
       </w:r>
-      <w:hyperlink r:id="rId9" w:history="1">
+      <w:hyperlink r:id="rId8" w:history="1">
         <w:r>
           <w:rPr>
             <w:rStyle w:val="Hyperlink"/>
@@ -112,14 +99,31 @@
         <w:spacing w:before="80" w:after="120"/>
         <w:jc w:val="center"/>
         <w:rPr>
+          <w:rFonts w:ascii="Arial" w:hAnsi="Arial" w:cs="Arial"/>
+          <w:color w:val="4B5563"/>
+          <w:sz w:val="21"/>
+          <w:szCs w:val="21"/>
+          <w:shd w:val="clear" w:color="auto" w:fill="FFFFFF"/>
+        </w:rPr>
+      </w:pPr>
+      <w:r>
+        <w:rPr>
           <w:b/>
           <w:bCs/>
           <w:color w:val="1E3A5F"/>
           <w:sz w:val="21"/>
           <w:szCs w:val="24"/>
         </w:rPr>
-      </w:pPr>
-      <w:r>
+        <w:t xml:space="preserve">Actively seeking an internship in IT / cybersecurity.</w:t>
+      </w:r>
+    </w:p>
+    <w:p>
+      <w:pPr>
+        <w:pBdr>
+          <w:bottom w:val="single" w:sz="12" w:space="0" w:color="1E3A5F"/>
+        </w:pBdr>
+        <w:spacing w:before="80" w:after="120"/>
+        <w:jc w:val="center"/>
         <w:rPr>
           <w:b/>
           <w:bCs/>
@@ -127,8 +131,7 @@
           <w:sz w:val="21"/>
           <w:szCs w:val="24"/>
         </w:rPr>
-        <w:t xml:space="preserve">Actively seeking a cybersecurity internship. Open to AI security, ML engineering, and applied research roles </w:t>
-      </w:r>
+      </w:pPr>
       <w:r>
         <w:rPr>
           <w:b/>
@@ -137,7 +140,7 @@
           <w:sz w:val="21"/>
           <w:szCs w:val="24"/>
         </w:rPr>
-        <w:t>full-time May 2027.</w:t>
+        <w:t xml:space="preserve">Open to AI security, ML engineering, and applied research roles full-time upon graduation.</w:t>
       </w:r>
     </w:p>
     <w:p>
@@ -331,7 +334,7 @@
           <w:sz w:val="21"/>
           <w:szCs w:val="21"/>
         </w:rPr>
-        <w:t>Nmap, Wireshark, pfSense, Snort, tcpdump, Rescuezilla, VirtualBox, Bruter, netstat, tasklist, gpedit.msc, Event Viewer, iptables, SSH, RDP</w:t>
+        <w:t>Nmap, Wireshark, pfSense, Snort, tcpdump, Rescuezilla, VirtualBox, Bruter, netstat, tasklist, gpedit.msc, Event Viewer, iptables, SSH, RDP, Docker, ZFS, Sanoid/Syncoid</w:t>
       </w:r>
     </w:p>
     <w:p>
@@ -357,7 +360,7 @@
           <w:sz w:val="21"/>
           <w:szCs w:val="21"/>
         </w:rPr>
-        <w:t>XGBoost, scikit-learn, Hugging Face Transformers, PyTorch, DistilBERT, Longformer, Ollama, Qwen 2.5 14B</w:t>
+        <w:t>XGBoost, scikit-learn, Hugging Face Transformers, PyTorch, DistilBERT, Longformer, Ollama, Qwen 2.5 14B, Open WebUI, RAG</w:t>
       </w:r>
     </w:p>
     <w:p>
@@ -409,287 +412,7 @@
           <w:sz w:val="21"/>
           <w:szCs w:val="21"/>
         </w:rPr>
-        <w:t>Windows 10/11, Windows Server, Kali Linux, Ubuntu Linux, Debian Linux, BSD/pfSense, Home Lab Environment</w:t>
-      </w:r>
-    </w:p>
-    <w:p>
-      <w:pPr>
-        <w:keepNext/>
-        <w:pBdr>
-          <w:bottom w:val="single" w:sz="12" w:space="0" w:color="1E3A5F"/>
-        </w:pBdr>
-        <w:spacing w:before="200" w:after="80"/>
-      </w:pPr>
-      <w:r>
-        <w:rPr>
-          <w:b/>
-          <w:bCs/>
-          <w:caps/>
-          <w:color w:val="1E3A5F"/>
-          <w:sz w:val="24"/>
-          <w:szCs w:val="24"/>
-        </w:rPr>
-        <w:t>AI Security Research</w:t>
-      </w:r>
-    </w:p>
-    <w:p>
-      <w:pPr>
-        <w:keepNext/>
-        <w:spacing w:before="120" w:after="40"/>
-      </w:pPr>
-      <w:r>
-        <w:rPr>
-          <w:b/>
-          <w:bCs/>
-        </w:rPr>
-        <w:t>COVA: Multi-Agent LLM Framework for Elder-Fraud Detection</w:t>
-      </w:r>
-      <w:r>
-        <w:t xml:space="preserve"> — </w:t>
-      </w:r>
-      <w:r>
-        <w:rPr>
-          <w:i/>
-          <w:iCs/>
-        </w:rPr>
-        <w:t>arXiv:2604.11752 | IEEE DASC 2026 (Under Review)</w:t>
-      </w:r>
-    </w:p>
-    <w:p>
-      <w:pPr>
-        <w:spacing w:after="80"/>
-      </w:pPr>
-      <w:r>
-        <w:rPr>
-          <w:b/>
-          <w:bCs/>
-          <w:sz w:val="21"/>
-          <w:szCs w:val="21"/>
-        </w:rPr>
-        <w:t>Lead author.</w:t>
-      </w:r>
-      <w:r>
-        <w:rPr>
-          <w:sz w:val="21"/>
-          <w:szCs w:val="21"/>
-        </w:rPr>
-        <w:t xml:space="preserve"> Designed and implemented a multi-agent generation pipeline using </w:t>
-      </w:r>
-      <w:r>
-        <w:rPr>
-          <w:b/>
-          <w:bCs/>
-          <w:sz w:val="21"/>
-          <w:szCs w:val="21"/>
-        </w:rPr>
-        <w:t>Qwen 2.5 14B via Ollama</w:t>
-      </w:r>
-      <w:r>
-        <w:rPr>
-          <w:sz w:val="21"/>
-          <w:szCs w:val="21"/>
-        </w:rPr>
-        <w:t xml:space="preserve"> to produce </w:t>
-      </w:r>
-      <w:r>
-        <w:rPr>
-          <w:b/>
-          <w:bCs/>
-          <w:sz w:val="21"/>
-          <w:szCs w:val="21"/>
-        </w:rPr>
-        <w:t>3,201 labeled synthetic scam conversations</w:t>
-      </w:r>
-      <w:r>
-        <w:rPr>
-          <w:sz w:val="21"/>
-          <w:szCs w:val="21"/>
-        </w:rPr>
-        <w:t xml:space="preserve"> across 8 elder-fraud categories. Engineered 28-feature extraction with TF-IDF, achieving </w:t>
-      </w:r>
-      <w:r>
-        <w:rPr>
-          <w:b/>
-          <w:bCs/>
-          <w:sz w:val="21"/>
-          <w:szCs w:val="21"/>
-        </w:rPr>
-        <w:t>72.5% baseline accuracy</w:t>
-      </w:r>
-      <w:r>
-        <w:rPr>
-          <w:sz w:val="21"/>
-          <w:szCs w:val="21"/>
-        </w:rPr>
-        <w:t xml:space="preserve"> with XGBoost. Built v2 label-audit tooling that corrected 1,594 mislabeled conversations.</w:t>
-      </w:r>
-    </w:p>
-    <w:p>
-      <w:pPr>
-        <w:keepNext/>
-        <w:spacing w:before="120" w:after="40"/>
-      </w:pPr>
-      <w:r>
-        <w:rPr>
-          <w:b/>
-          <w:bCs/>
-        </w:rPr>
-        <w:t>COVA-X: Scaling Synthetic Fraud Conversations with Transformer Classification</w:t>
-      </w:r>
-      <w:r>
-        <w:t xml:space="preserve"> — </w:t>
-      </w:r>
-      <w:r>
-        <w:rPr>
-          <w:i/>
-          <w:iCs/>
-        </w:rPr>
-        <w:t>arXiv:2606.06879 | IEEE BigData 2026 (Under Review)</w:t>
-      </w:r>
-    </w:p>
-    <w:p>
-      <w:pPr>
-        <w:spacing w:after="80"/>
-      </w:pPr>
-      <w:r>
-        <w:rPr>
-          <w:b/>
-          <w:bCs/>
-          <w:sz w:val="21"/>
-          <w:szCs w:val="21"/>
-        </w:rPr>
-        <w:t>Lead author.</w:t>
-      </w:r>
-      <w:r>
-        <w:rPr>
-          <w:sz w:val="21"/>
-          <w:szCs w:val="21"/>
-        </w:rPr>
-        <w:t xml:space="preserve"> Scaled dataset to </w:t>
-      </w:r>
-      <w:r>
-        <w:rPr>
-          <w:b/>
-          <w:bCs/>
-          <w:sz w:val="21"/>
-          <w:szCs w:val="21"/>
-        </w:rPr>
-        <w:t>10,985 conversations</w:t>
-      </w:r>
-      <w:r>
-        <w:rPr>
-          <w:sz w:val="21"/>
-          <w:szCs w:val="21"/>
-        </w:rPr>
-        <w:t xml:space="preserve"> across dual-GPU workstations. Designed three-role virtual-kidnapping architecture reducing artifact rates by </w:t>
-      </w:r>
-      <w:r>
-        <w:rPr>
-          <w:b/>
-          <w:bCs/>
-          <w:sz w:val="21"/>
-          <w:szCs w:val="21"/>
-        </w:rPr>
-        <w:t>20 percentage points</w:t>
-      </w:r>
-      <w:r>
-        <w:rPr>
-          <w:sz w:val="21"/>
-          <w:szCs w:val="21"/>
-        </w:rPr>
-        <w:t xml:space="preserve">. Longformer achieved </w:t>
-      </w:r>
-      <w:r>
-        <w:rPr>
-          <w:b/>
-          <w:bCs/>
-          <w:sz w:val="21"/>
-          <w:szCs w:val="21"/>
-        </w:rPr>
-        <w:t>79.71% accuracy / 0.779 macro-F1</w:t>
-      </w:r>
-      <w:r>
-        <w:rPr>
-          <w:sz w:val="21"/>
-          <w:szCs w:val="21"/>
-        </w:rPr>
-        <w:t>, confirming data-scale hypothesis from COVA.</w:t>
-      </w:r>
-    </w:p>
-    <w:p>
-      <w:pPr>
-        <w:keepNext/>
-        <w:spacing w:before="120" w:after="80"/>
-      </w:pPr>
-      <w:r>
-        <w:rPr>
-          <w:b/>
-          <w:bCs/>
-        </w:rPr>
-        <w:t>ScamLingua.org</w:t>
-      </w:r>
-      <w:r>
-        <w:rPr>
-          <w:sz w:val="21"/>
-          <w:szCs w:val="21"/>
-        </w:rPr>
-        <w:t xml:space="preserve"> — Self-built distribution platform for COVA research datasets. Designed with trust-focused web engineering principles and CSP hardening.</w:t>
-      </w:r>
-    </w:p>
-    <w:p>
-      <w:pPr>
-        <w:keepNext/>
-        <w:pBdr>
-          <w:bottom w:val="single" w:sz="12" w:space="0" w:color="1E3A5F"/>
-        </w:pBdr>
-        <w:spacing w:before="200" w:after="80"/>
-      </w:pPr>
-      <w:r>
-        <w:rPr>
-          <w:b/>
-          <w:bCs/>
-          <w:caps/>
-          <w:color w:val="1E3A5F"/>
-          <w:sz w:val="24"/>
-          <w:szCs w:val="24"/>
-        </w:rPr>
-        <w:t>Cybersecurity Projects</w:t>
-      </w:r>
-    </w:p>
-    <w:p>
-      <w:pPr>
-        <w:keepNext/>
-        <w:spacing w:before="120" w:after="60"/>
-      </w:pPr>
-      <w:r>
-        <w:rPr>
-          <w:b/>
-          <w:bCs/>
-        </w:rPr>
-        <w:t>Secure File Sharing System (Python TCP Sockets)</w:t>
-      </w:r>
-      <w:r>
-        <w:rPr>
-          <w:i/>
-          <w:iCs/>
-        </w:rPr>
-        <w:t xml:space="preserve"> — Milestone Project</w:t>
-      </w:r>
-    </w:p>
-    <w:p>
-      <w:pPr>
-        <w:spacing w:after="100"/>
-        <w:rPr>
-          <w:sz w:val="21"/>
-          <w:szCs w:val="21"/>
-        </w:rPr>
-      </w:pPr>
-      <w:r>
-        <w:rPr>
-          <w:sz w:val="21"/>
-          <w:szCs w:val="21"/>
-        </w:rPr>
-        <w:t>Engineered an encrypted client-server application using Python TCP sockets featuring secure user authentication and isolated directories. Implemented data-integrity checks and defensive Python error handling to ensure resilient file operations and secure communication.</w:t>
+        <w:t>Windows 10/11, Windows Server, Kali Linux, Ubuntu Linux, Debian Linux, BSD/pfSense, Unraid, Home Lab Environment</w:t>
       </w:r>
     </w:p>
     <w:p>
@@ -802,7 +525,6 @@
           <w:sz w:val="21"/>
           <w:szCs w:val="21"/>
         </w:rPr>
-        <w:lastRenderedPageBreak/>
         <w:t xml:space="preserve">Operating System Hardening: </w:t>
       </w:r>
       <w:r>
@@ -1020,6 +742,410 @@
           <w:sz w:val="24"/>
           <w:szCs w:val="24"/>
         </w:rPr>
+        <w:t>AI Security Research</w:t>
+      </w:r>
+    </w:p>
+    <w:p>
+      <w:pPr>
+        <w:spacing w:after="80"/>
+        <w:rPr>
+          <w:i/>
+          <w:iCs/>
+          <w:sz w:val="21"/>
+          <w:szCs w:val="21"/>
+        </w:rPr>
+      </w:pPr>
+      <w:r>
+        <w:rPr>
+          <w:i/>
+          <w:iCs/>
+          <w:sz w:val="21"/>
+          <w:szCs w:val="21"/>
+        </w:rPr>
+        <w:t>Mentored by Dr. Ayan Roy (Christopher Newport University) — CCI Undergraduate Research Program</w:t>
+      </w:r>
+    </w:p>
+    <w:p>
+      <w:pPr>
+        <w:keepNext/>
+        <w:spacing w:before="120" w:after="40"/>
+      </w:pPr>
+      <w:r>
+        <w:rPr>
+          <w:b/>
+          <w:bCs/>
+        </w:rPr>
+        <w:t>COVA: Multi-Agent LLM Framework for Elder-Fraud Detection</w:t>
+      </w:r>
+      <w:r>
+        <w:t xml:space="preserve"> — </w:t>
+      </w:r>
+      <w:r>
+        <w:rPr>
+          <w:i/>
+          <w:iCs/>
+        </w:rPr>
+        <w:t>arXiv:2604.11752 | IEEE DASC 2026 (Under Review)</w:t>
+      </w:r>
+    </w:p>
+    <w:p>
+      <w:pPr>
+        <w:spacing w:after="80"/>
+      </w:pPr>
+      <w:r>
+        <w:rPr>
+          <w:b/>
+          <w:bCs/>
+          <w:sz w:val="21"/>
+          <w:szCs w:val="21"/>
+        </w:rPr>
+        <w:t>Lead author.</w:t>
+      </w:r>
+      <w:r>
+        <w:rPr>
+          <w:sz w:val="21"/>
+          <w:szCs w:val="21"/>
+        </w:rPr>
+        <w:t xml:space="preserve"> Designed and implemented a multi-agent generation pipeline using </w:t>
+      </w:r>
+      <w:r>
+        <w:rPr>
+          <w:b/>
+          <w:bCs/>
+          <w:sz w:val="21"/>
+          <w:szCs w:val="21"/>
+        </w:rPr>
+        <w:t>Qwen 2.5 14B via Ollama</w:t>
+      </w:r>
+      <w:r>
+        <w:rPr>
+          <w:sz w:val="21"/>
+          <w:szCs w:val="21"/>
+        </w:rPr>
+        <w:t xml:space="preserve"> to produce </w:t>
+      </w:r>
+      <w:r>
+        <w:rPr>
+          <w:b/>
+          <w:bCs/>
+          <w:sz w:val="21"/>
+          <w:szCs w:val="21"/>
+        </w:rPr>
+        <w:t>3,201 labeled synthetic scam conversations</w:t>
+      </w:r>
+      <w:r>
+        <w:rPr>
+          <w:sz w:val="21"/>
+          <w:szCs w:val="21"/>
+        </w:rPr>
+        <w:t xml:space="preserve"> across 8 elder-fraud categories. Engineered 28-feature extraction with TF-IDF, achieving </w:t>
+      </w:r>
+      <w:r>
+        <w:rPr>
+          <w:b/>
+          <w:bCs/>
+          <w:sz w:val="21"/>
+          <w:szCs w:val="21"/>
+        </w:rPr>
+        <w:t>72.5% baseline accuracy</w:t>
+      </w:r>
+      <w:r>
+        <w:rPr>
+          <w:sz w:val="21"/>
+          <w:szCs w:val="21"/>
+        </w:rPr>
+        <w:t xml:space="preserve"> with XGBoost. Built v2 label-audit tooling that corrected 1,594 mislabeled conversations.</w:t>
+      </w:r>
+    </w:p>
+    <w:p>
+      <w:pPr>
+        <w:keepNext/>
+        <w:spacing w:before="120" w:after="40"/>
+      </w:pPr>
+      <w:r>
+        <w:rPr>
+          <w:b/>
+          <w:bCs/>
+        </w:rPr>
+        <w:t>COVA-X: Scaling Synthetic Fraud Conversations with Transformer Classification</w:t>
+      </w:r>
+      <w:r>
+        <w:t xml:space="preserve"> — </w:t>
+      </w:r>
+      <w:r>
+        <w:rPr>
+          <w:i/>
+          <w:iCs/>
+        </w:rPr>
+        <w:t>arXiv:2606.06879 | IEEE BigData 2026 (Under Review)</w:t>
+      </w:r>
+    </w:p>
+    <w:p>
+      <w:pPr>
+        <w:spacing w:after="80"/>
+      </w:pPr>
+      <w:r>
+        <w:rPr>
+          <w:b/>
+          <w:bCs/>
+          <w:sz w:val="21"/>
+          <w:szCs w:val="21"/>
+        </w:rPr>
+        <w:t>Lead author.</w:t>
+      </w:r>
+      <w:r>
+        <w:rPr>
+          <w:sz w:val="21"/>
+          <w:szCs w:val="21"/>
+        </w:rPr>
+        <w:t xml:space="preserve"> Scaled dataset to </w:t>
+      </w:r>
+      <w:r>
+        <w:rPr>
+          <w:b/>
+          <w:bCs/>
+          <w:sz w:val="21"/>
+          <w:szCs w:val="21"/>
+        </w:rPr>
+        <w:t>10,985 conversations</w:t>
+      </w:r>
+      <w:r>
+        <w:rPr>
+          <w:sz w:val="21"/>
+          <w:szCs w:val="21"/>
+        </w:rPr>
+        <w:t xml:space="preserve"> across dual-GPU workstations. Designed three-role virtual-kidnapping architecture reducing artifact rates by </w:t>
+      </w:r>
+      <w:r>
+        <w:rPr>
+          <w:b/>
+          <w:bCs/>
+          <w:sz w:val="21"/>
+          <w:szCs w:val="21"/>
+        </w:rPr>
+        <w:t>20 percentage points</w:t>
+      </w:r>
+      <w:r>
+        <w:rPr>
+          <w:sz w:val="21"/>
+          <w:szCs w:val="21"/>
+        </w:rPr>
+        <w:t xml:space="preserve">. Longformer achieved </w:t>
+      </w:r>
+      <w:r>
+        <w:rPr>
+          <w:b/>
+          <w:bCs/>
+          <w:sz w:val="21"/>
+          <w:szCs w:val="21"/>
+        </w:rPr>
+        <w:t>79.71% accuracy / 0.779 macro-F1</w:t>
+      </w:r>
+      <w:r>
+        <w:rPr>
+          <w:sz w:val="21"/>
+          <w:szCs w:val="21"/>
+        </w:rPr>
+        <w:t>, confirming data-scale hypothesis from COVA.</w:t>
+      </w:r>
+    </w:p>
+    <w:p>
+      <w:pPr>
+        <w:keepNext/>
+        <w:spacing w:before="120" w:after="80"/>
+      </w:pPr>
+      <w:r>
+        <w:rPr>
+          <w:b/>
+          <w:bCs/>
+        </w:rPr>
+        <w:lastRenderedPageBreak/>
+        <w:t>ScamLingua.org</w:t>
+      </w:r>
+      <w:r>
+        <w:rPr>
+          <w:sz w:val="21"/>
+          <w:szCs w:val="21"/>
+        </w:rPr>
+        <w:t xml:space="preserve"> — Self-built distribution platform for COVA research datasets. Designed with trust-focused web engineering principles and CSP hardening.</w:t>
+      </w:r>
+    </w:p>
+    <w:p>
+      <w:pPr>
+        <w:keepNext/>
+        <w:pBdr>
+          <w:bottom w:val="single" w:sz="12" w:space="0" w:color="1E3A5F"/>
+        </w:pBdr>
+        <w:spacing w:before="200" w:after="80"/>
+      </w:pPr>
+      <w:r>
+        <w:rPr>
+          <w:b/>
+          <w:bCs/>
+          <w:caps/>
+          <w:color w:val="1E3A5F"/>
+          <w:sz w:val="24"/>
+          <w:szCs w:val="24"/>
+        </w:rPr>
+        <w:t>Cybersecurity Projects</w:t>
+      </w:r>
+    </w:p>
+    <w:p>
+      <w:pPr>
+        <w:keepNext/>
+        <w:spacing w:before="120" w:after="60"/>
+      </w:pPr>
+      <w:r>
+        <w:rPr>
+          <w:b/>
+          <w:bCs/>
+        </w:rPr>
+        <w:t>Self-Hosted Research NAS &amp; Private AI Server (Unraid, ZFS, Docker)</w:t>
+      </w:r>
+      <w:r>
+        <w:rPr>
+          <w:i/>
+          <w:iCs/>
+        </w:rPr>
+        <w:t xml:space="preserve"> — Personal Project</w:t>
+      </w:r>
+    </w:p>
+    <w:p>
+      <w:pPr>
+        <w:spacing w:after="100"/>
+        <w:rPr>
+          <w:sz w:val="21"/>
+          <w:szCs w:val="21"/>
+        </w:rPr>
+      </w:pPr>
+      <w:r>
+        <w:rPr>
+          <w:sz w:val="21"/>
+          <w:szCs w:val="21"/>
+        </w:rPr>
+        <w:t xml:space="preserve">Designed, built, and hardened a research storage server on a mirrored ZFS pool with a </w:t>
+      </w:r>
+      <w:r>
+        <w:rPr>
+          <w:b/>
+          <w:bCs/>
+          <w:sz w:val="21"/>
+          <w:szCs w:val="21"/>
+        </w:rPr>
+        <w:t xml:space="preserve">3-2-1 backup</w:t>
+      </w:r>
+      <w:r>
+        <w:rPr>
+          <w:sz w:val="21"/>
+          <w:szCs w:val="21"/>
+        </w:rPr>
+        <w:t xml:space="preserve"> posture: daily snapshots, replication, monthly integrity scrubs, UPS-triggered clean shutdown, a nightly encrypted off-site copy, and an air-gapped drive. Applied </w:t>
+      </w:r>
+      <w:r>
+        <w:rPr>
+          <w:b/>
+          <w:bCs/>
+          <w:sz w:val="21"/>
+          <w:szCs w:val="21"/>
+        </w:rPr>
+        <w:t xml:space="preserve">least-privilege</w:t>
+      </w:r>
+      <w:r>
+        <w:rPr>
+          <w:sz w:val="21"/>
+          <w:szCs w:val="21"/>
+        </w:rPr>
+        <w:t xml:space="preserve"> shares and accounts with no inbound internet exposure. Deployed a private, GPU-accelerated </w:t>
+      </w:r>
+      <w:r>
+        <w:rPr>
+          <w:b/>
+          <w:bCs/>
+          <w:sz w:val="21"/>
+          <w:szCs w:val="21"/>
+        </w:rPr>
+        <w:t xml:space="preserve">RAG assistant</w:t>
+      </w:r>
+      <w:r>
+        <w:rPr>
+          <w:sz w:val="21"/>
+          <w:szCs w:val="21"/>
+        </w:rPr>
+        <w:t xml:space="preserve"> (Ollama) over ~360 research papers, treating the AI as an untrusted component with a bounded blast radius.</w:t>
+      </w:r>
+    </w:p>
+    <w:p>
+      <w:pPr>
+        <w:keepNext/>
+        <w:spacing w:before="120" w:after="60"/>
+      </w:pPr>
+      <w:r>
+        <w:rPr>
+          <w:b/>
+          <w:bCs/>
+        </w:rPr>
+        <w:t>Secure File Sharing System (Python TCP Sockets)</w:t>
+      </w:r>
+      <w:r>
+        <w:rPr>
+          <w:i/>
+          <w:iCs/>
+        </w:rPr>
+        <w:t xml:space="preserve"> — Milestone Project</w:t>
+      </w:r>
+    </w:p>
+    <w:p>
+      <w:pPr>
+        <w:spacing w:after="100"/>
+        <w:rPr>
+          <w:sz w:val="21"/>
+          <w:szCs w:val="21"/>
+        </w:rPr>
+      </w:pPr>
+      <w:r>
+        <w:rPr>
+          <w:sz w:val="21"/>
+          <w:szCs w:val="21"/>
+        </w:rPr>
+        <w:t>Engineered an encrypted client-server application using Python TCP sockets with secure user authentication and isolated directories, data-integrity checks, and defensive error handling for resilient file operations.</w:t>
+      </w:r>
+    </w:p>
+    <w:p>
+      <w:pPr>
+        <w:spacing w:before="120" w:after="100"/>
+      </w:pPr>
+      <w:r>
+        <w:rPr>
+          <w:b/>
+          <w:bCs/>
+        </w:rPr>
+        <w:t>LockBadges (AutoHotkey v2)</w:t>
+      </w:r>
+      <w:r>
+        <w:rPr>
+          <w:sz w:val="21"/>
+          <w:szCs w:val="21"/>
+        </w:rPr>
+        <w:t xml:space="preserve"> — Shipped a Windows utility for on-screen lock-key indicators. Privacy-first: reads toggle bits rather than a keyboard hook, so keystrokes are never intercepted; no network access or telemetry.</w:t>
+      </w:r>
+    </w:p>
+    <w:p>
+      <w:pPr>
+        <w:keepNext/>
+        <w:pBdr>
+          <w:bottom w:val="single" w:sz="12" w:space="0" w:color="1E3A5F"/>
+        </w:pBdr>
+        <w:spacing w:before="200" w:after="80"/>
+      </w:pPr>
+      <w:r>
+        <w:rPr>
+          <w:b/>
+          <w:bCs/>
+          <w:caps/>
+          <w:color w:val="1E3A5F"/>
+          <w:sz w:val="24"/>
+          <w:szCs w:val="24"/>
+        </w:rPr>
         <w:t>Professional Experience</w:t>
       </w:r>
     </w:p>
@@ -1047,12 +1173,6 @@
           <w:iCs/>
         </w:rPr>
         <w:t>2012 – 2024 (Closed)</w:t>
-      </w:r>
-      <w:r>
-        <w:rPr>
-          <w:i/>
-          <w:iCs/>
-        </w:rPr>
         <w:tab/>
         <w:t>Property Management and Estate Fiduciary</w:t>
       </w:r>
@@ -1132,12 +1252,6 @@
           <w:iCs/>
         </w:rPr>
         <w:t>2021 – 2022</w:t>
-      </w:r>
-      <w:r>
-        <w:rPr>
-          <w:i/>
-          <w:iCs/>
-        </w:rPr>
         <w:tab/>
         <w:t>Foreclosure Relief Underwriter</w:t>
       </w:r>
@@ -1181,16 +1295,19 @@
         <w:pStyle w:val="ListParagraph"/>
         <w:numPr>
           <w:ilvl w:val="0"/>
-          <w:numId w:val="1"/>
+          <w:numId w:val="4"/>
         </w:numPr>
         <w:spacing w:after="40"/>
-      </w:pPr>
-      <w:r>
-        <w:rPr>
-          <w:sz w:val="21"/>
-          <w:szCs w:val="21"/>
-        </w:rPr>
-        <w:t>Led research, vendor evaluation, and deployment of a secure SMS communication platform, maintaining data protection and compliance.</w:t>
+        <w:rPr>
+          <w:sz w:val="21"/>
+        </w:rPr>
+      </w:pPr>
+      <w:r>
+        <w:rPr>
+          <w:sz w:val="21"/>
+          <w:szCs w:val="21"/>
+        </w:rPr>
+        <w:t>Contributed to revisions of Encompass, the loan origination platform, streamlining the application process for staff and applicants.</w:t>
       </w:r>
     </w:p>
     <w:p>
@@ -1236,12 +1353,6 @@
           <w:iCs/>
         </w:rPr>
         <w:t>2017 – 2021</w:t>
-      </w:r>
-      <w:r>
-        <w:rPr>
-          <w:i/>
-          <w:iCs/>
-        </w:rPr>
         <w:tab/>
         <w:t>Loss Mitigation Underwriter</w:t>
       </w:r>
@@ -1377,7 +1488,7 @@
         <w:rPr>
           <w:sz w:val="21"/>
         </w:rPr>
-        <w:t>Operated HUD/FHA (EVARS), VA (VALERI), FNMA HSSN, and FHLMC Workout Prospector underwriting platforms, plus CAIVRS, Black-Knight/MSP, PACER, and LexisNexis.</w:t>
+        <w:t>Operated eight federal and investor underwriting, credit, and court-record systems daily.</w:t>
       </w:r>
     </w:p>
     <w:p>
@@ -1423,12 +1534,6 @@
           <w:iCs/>
         </w:rPr>
         <w:t>2011 – 2014</w:t>
-      </w:r>
-      <w:r>
-        <w:rPr>
-          <w:i/>
-          <w:iCs/>
-        </w:rPr>
         <w:tab/>
         <w:t>SPOC Relationship Manager</w:t>
       </w:r>
@@ -1447,131 +1552,7 @@
           <w:sz w:val="21"/>
           <w:szCs w:val="21"/>
         </w:rPr>
-        <w:t>Sole point of accountability for borrower and third-party foreclosure-prevention inquiries.</w:t>
-      </w:r>
-    </w:p>
-    <w:p>
-      <w:pPr>
-        <w:pStyle w:val="ListParagraph"/>
-        <w:numPr>
-          <w:ilvl w:val="0"/>
-          <w:numId w:val="1"/>
-        </w:numPr>
-        <w:spacing w:after="40"/>
-      </w:pPr>
-      <w:r>
-        <w:rPr>
-          <w:sz w:val="21"/>
-          <w:szCs w:val="21"/>
-        </w:rPr>
-        <w:t>Directed a high-volume loss mitigation pipeline, exceeding investor rate benchmarks by 30%.</w:t>
-      </w:r>
-    </w:p>
-    <w:p>
-      <w:pPr>
-        <w:pStyle w:val="ListParagraph"/>
-        <w:numPr>
-          <w:ilvl w:val="0"/>
-          <w:numId w:val="3"/>
-        </w:numPr>
-        <w:spacing w:after="40"/>
-        <w:rPr>
-          <w:sz w:val="21"/>
-        </w:rPr>
-      </w:pPr>
-      <w:r>
-        <w:rPr>
-          <w:sz w:val="21"/>
-        </w:rPr>
-        <w:t>Handled sensitive financial and legal documentation with full confidentiality and accuracy.</w:t>
-      </w:r>
-    </w:p>
-    <w:p>
-      <w:pPr>
-        <w:keepNext/>
-        <w:tabs>
-          <w:tab w:val="right" w:pos="10800"/>
-        </w:tabs>
-        <w:spacing w:before="200" w:after="60"/>
-      </w:pPr>
-      <w:r>
-        <w:rPr>
-          <w:b/>
-          <w:bCs/>
-        </w:rPr>
-        <w:t>AmeriCorps Habitat for Humanity</w:t>
-      </w:r>
-      <w:r>
-        <w:t xml:space="preserve"> | Jacksonville, FL | </w:t>
-      </w:r>
-      <w:r>
-        <w:rPr>
-          <w:i/>
-          <w:iCs/>
-        </w:rPr>
-        <w:t>2009 – 2011</w:t>
-      </w:r>
-      <w:r>
-        <w:rPr>
-          <w:i/>
-          <w:iCs/>
-        </w:rPr>
-        <w:tab/>
-        <w:t>Construction Team Leader</w:t>
-      </w:r>
-    </w:p>
-    <w:p>
-      <w:pPr>
-        <w:keepNext/>
-        <w:spacing w:after="60"/>
-        <w:rPr>
-          <w:sz w:val="21"/>
-        </w:rPr>
-      </w:pPr>
-      <w:r>
-        <w:rPr>
-          <w:iCs/>
-          <w:sz w:val="21"/>
-          <w:szCs w:val="21"/>
-        </w:rPr>
-        <w:t>Led volunteer crews from C-suite executives to military personnel on a $1.2M residential build.</w:t>
-      </w:r>
-    </w:p>
-    <w:p>
-      <w:pPr>
-        <w:pStyle w:val="ListParagraph"/>
-        <w:keepNext/>
-        <w:numPr>
-          <w:ilvl w:val="0"/>
-          <w:numId w:val="1"/>
-        </w:numPr>
-        <w:spacing w:after="40"/>
-      </w:pPr>
-      <w:r>
-        <w:rPr>
-          <w:sz w:val="21"/>
-          <w:szCs w:val="21"/>
-        </w:rPr>
-        <w:t>Supervised and motivated up to 150+ volunteers per day across multiple residential construction projects.</w:t>
-      </w:r>
-    </w:p>
-    <w:p>
-      <w:pPr>
-        <w:pStyle w:val="ListParagraph"/>
-        <w:numPr>
-          <w:ilvl w:val="0"/>
-          <w:numId w:val="3"/>
-        </w:numPr>
-        <w:spacing w:after="40"/>
-        <w:rPr>
-          <w:sz w:val="21"/>
-        </w:rPr>
-      </w:pPr>
-      <w:r>
-        <w:rPr>
-          <w:sz w:val="21"/>
-        </w:rPr>
-        <w:t>Delivered 100+ completed homes while maintaining 98% quality standards.</w:t>
+        <w:t>Sole point of accountability for borrower and third-party foreclosure-prevention inquiries; directed a high-volume loss mitigation pipeline, exceeding investor rate benchmarks by 30%.</w:t>
       </w:r>
     </w:p>
     <w:p>
@@ -1598,6 +1579,10 @@
       <w:pPr>
         <w:keepNext/>
         <w:spacing w:after="60"/>
+        <w:rPr>
+          <w:sz w:val="21"/>
+          <w:szCs w:val="21"/>
+        </w:rPr>
       </w:pPr>
       <w:r>
         <w:rPr>
@@ -1611,7 +1596,7 @@
           <w:sz w:val="21"/>
           <w:szCs w:val="21"/>
         </w:rPr>
-        <w:t xml:space="preserve"> — B.S. Cybersecurity | GPA: 3.9 | Expected: May 2027</w:t>
+        <w:t xml:space="preserve"> — B.S. Cybersecurity | GPA: 3.9</w:t>
       </w:r>
     </w:p>
     <w:p>
@@ -1664,7 +1649,7 @@
 </file>
 
 <file path=word/numbering.xml><?xml version="1.0" encoding="utf-8"?>
-<w:numbering xmlns:wpc="http://schemas.microsoft.com/office/word/2010/wordprocessingCanvas" xmlns:cx="http://schemas.microsoft.com/office/drawing/2014/chartex" xmlns:cx1="http://schemas.microsoft.com/office/drawing/2015/9/8/chartex" xmlns:cx2="http://schemas.microsoft.com/office/drawing/2015/10/21/chartex" xmlns:cx3="http://schemas.microsoft.com/office/drawing/2016/5/9/chartex" xmlns:cx4="http://schemas.microsoft.com/office/drawing/2016/5/10/chartex" xmlns:cx5="http://schemas.microsoft.com/office/drawing/2016/5/11/chartex" xmlns:cx6="http://schemas.microsoft.com/office/drawing/2016/5/12/chartex" xmlns:cx7="http://schemas.microsoft.com/office/drawing/2016/5/13/chartex" xmlns:cx8="http://schemas.microsoft.com/office/drawing/2016/5/14/chartex" xmlns:mc="http://schemas.openxmlformats.org/markup-compatibility/2006" xmlns:aink="http://schemas.microsoft.com/office/drawing/2016/ink" xmlns:am3d="http://schemas.microsoft.com/office/drawing/2017/model3d" xmlns:o="urn:schemas-microsoft-com:office:office" xmlns:oel="http://schemas.microsoft.com/office/2019/extlst" xmlns:r="http://schemas.openxmlformats.org/officeDocument/2006/relationships" xmlns:m="http://schemas.openxmlformats.org/officeDocument/2006/math" xmlns:v="urn:schemas-microsoft-com:vml" xmlns:wp14="http://schemas.microsoft.com/office/word/2010/wordprocessingDrawing" xmlns:wp="http://schemas.openxmlformats.org/drawingml/2006/wordprocessingDrawing" xmlns:w10="urn:schemas-microsoft-com:office:word" xmlns:w="http://schemas.openxmlformats.org/wordprocessingml/2006/main" xmlns:w14="http://schemas.microsoft.com/office/word/2010/wordml" xmlns:w15="http://schemas.microsoft.com/office/word/2012/wordml" xmlns:w16cex="http://schemas.microsoft.com/office/word/2018/wordml/cex" xmlns:w16cid="http://schemas.microsoft.com/office/word/2016/wordml/cid" xmlns:w16="http://schemas.microsoft.com/office/word/2018/wordml" xmlns:w16du="http://schemas.microsoft.com/office/word/2023/wordml/word16du" xmlns:w16sdtdh="http://schemas.microsoft.com/office/word/2020/wordml/sdtdatahash" xmlns:w16sdtfl="http://schemas.microsoft.com/office/word/2024/wordml/sdtformatlock" xmlns:w16se="http://schemas.microsoft.com/office/word/2015/wordml/symex" xmlns:wpg="http://schemas.microsoft.com/office/word/2010/wordprocessingGroup" xmlns:wpi="http://schemas.microsoft.com/office/word/2010/wordprocessingInk" xmlns:wne="http://schemas.microsoft.com/office/word/2006/wordml" xmlns:wps="http://schemas.microsoft.com/office/word/2010/wordprocessingShape" mc:Ignorable="w14 w15 w16se w16cid w16 w16cex w16sdtdh w16sdtfl w16du wp14">
+<w:numbering xmlns:wpc="http://schemas.microsoft.com/office/word/2010/wordprocessingCanvas" xmlns:cx="http://schemas.microsoft.com/office/drawing/2014/chartex" xmlns:cx1="http://schemas.microsoft.com/office/drawing/2015/9/8/chartex" xmlns:cx2="http://schemas.microsoft.com/office/drawing/2015/10/21/chartex" xmlns:cx3="http://schemas.microsoft.com/office/drawing/2016/5/9/chartex" xmlns:cx4="http://schemas.microsoft.com/office/drawing/2016/5/10/chartex" xmlns:cx5="http://schemas.microsoft.com/office/drawing/2016/5/11/chartex" xmlns:cx6="http://schemas.microsoft.com/office/drawing/2016/5/12/chartex" xmlns:cx7="http://schemas.microsoft.com/office/drawing/2016/5/13/chartex" xmlns:cx8="http://schemas.microsoft.com/office/drawing/2016/5/14/chartex" xmlns:mc="http://schemas.openxmlformats.org/markup-compatibility/2006" xmlns:aink="http://schemas.microsoft.com/office/drawing/2016/ink" xmlns:am3d="http://schemas.microsoft.com/office/drawing/2017/model3d" xmlns:o="urn:schemas-microsoft-com:office:office" xmlns:oel="http://schemas.microsoft.com/office/2019/extlst" xmlns:r="http://schemas.openxmlformats.org/officeDocument/2006/relationships" xmlns:m="http://schemas.openxmlformats.org/officeDocument/2006/math" xmlns:v="urn:schemas-microsoft-com:vml" xmlns:wp14="http://schemas.microsoft.com/office/word/2010/wordprocessingDrawing" xmlns:wp="http://schemas.openxmlformats.org/drawingml/2006/wordprocessingDrawing" xmlns:w10="urn:schemas-microsoft-com:office:word" xmlns:w="http://schemas.openxmlformats.org/wordprocessingml/2006/main" xmlns:w14="http://schemas.microsoft.com/office/word/2010/wordml" xmlns:w15="http://schemas.microsoft.com/office/word/2012/wordml" xmlns:w16cei="http://schemas.microsoft.com/office/word/2026/wordml/cei" xmlns:w16cex="http://schemas.microsoft.com/office/word/2018/wordml/cex" xmlns:w16cid="http://schemas.microsoft.com/office/word/2016/wordml/cid" xmlns:w16="http://schemas.microsoft.com/office/word/2018/wordml" xmlns:w16du="http://schemas.microsoft.com/office/word/2023/wordml/word16du" xmlns:w16sdtdh="http://schemas.microsoft.com/office/word/2020/wordml/sdtdatahash" xmlns:w16sdtfl="http://schemas.microsoft.com/office/word/2024/wordml/sdtformatlock" xmlns:w16se="http://schemas.microsoft.com/office/word/2015/wordml/symex" xmlns:wpg="http://schemas.microsoft.com/office/word/2010/wordprocessingGroup" xmlns:wpi="http://schemas.microsoft.com/office/word/2010/wordprocessingInk" xmlns:wne="http://schemas.microsoft.com/office/word/2006/wordml" xmlns:wps="http://schemas.microsoft.com/office/word/2010/wordprocessingShape" mc:Ignorable="w14 w15 w16se w16cid w16 w16cex w16sdtdh w16sdtfl w16du wp14">
   <w:abstractNum w:abstractNumId="0" w15:restartNumberingAfterBreak="0">
     <w:nsid w:val="15910C8E"/>
     <w:multiLevelType w:val="multilevel"/>

</xml_diff>

<commit_message>
Publication status: venue-free preprint wording for COVA and COVA-X
- Site: both research cards badge "Preprint" (neutral slate tag);
  venue lines -> "arXiv: <id> • Peer review in progress".
- Summary (site, JSON-LD, docx): "(COVA and COVA-X, both in the
  peer-review process)".
- Metrics: "Papers Under Review" -> "arXiv Preprints" (count 2).
- docx paper lines -> "arXiv:<id> | Peer review in progress"; each
  arXiv ID is now a hyperlink to its abs page (Hyperlink style, italic
  kept).
- PDF regenerated from the docx with LibreOffice 26.8 (previous export
  used 24.2); still 2 pages, line breaks unchanged.
</commit_message>
<xml_diff>
--- a/_source/Carl_Lochstampfor_Resume.docx
+++ b/_source/Carl_Lochstampfor_Resume.docx
@@ -204,7 +204,7 @@
           <w:sz w:val="21"/>
           <w:szCs w:val="21"/>
         </w:rPr>
-        <w:t xml:space="preserve"> certifications. AI security researcher with two arXiv preprints on synthetic fraud detection (COVA framework, under review at IEEE DASC and IEEE BigData 2026) and a live dataset platform (ScamLingua.org). Background includes over a decade in high-risk, regulated financial environments (FNMA, FHLMC, FHA, VA), applying the same rigor to incident response, system hardening, and AI governance. Proven record of managing </w:t>
+        <w:t xml:space="preserve"> certifications. AI security researcher with two arXiv preprints on synthetic fraud detection (COVA and COVA-X, both in the peer-review process) and a live dataset platform (ScamLingua.org). Background includes over a decade in high-risk, regulated financial environments (FNMA, FHLMC, FHA, VA), applying the same rigor to incident response, system hardening, and AI governance. Proven record of managing </w:t>
       </w:r>
       <w:r>
         <w:rPr>
@@ -780,12 +780,22 @@
       <w:r>
         <w:t xml:space="preserve"> — </w:t>
       </w:r>
+      <w:hyperlink r:id="rId11" w:history="1">
+        <w:r>
+          <w:rPr>
+            <w:rStyle w:val="Hyperlink"/>
+            <w:i/>
+            <w:iCs/>
+          </w:rPr>
+          <w:t>arXiv:2604.11752</w:t>
+        </w:r>
+      </w:hyperlink>
       <w:r>
         <w:rPr>
           <w:i/>
           <w:iCs/>
         </w:rPr>
-        <w:t>arXiv:2604.11752 | IEEE DASC 2026 (Under Review)</w:t>
+        <w:t xml:space="preserve"> | Peer review in progress</w:t>
       </w:r>
     </w:p>
     <w:p>
@@ -872,12 +882,22 @@
       <w:r>
         <w:t xml:space="preserve"> — </w:t>
       </w:r>
+      <w:hyperlink r:id="rId12" w:history="1">
+        <w:r>
+          <w:rPr>
+            <w:rStyle w:val="Hyperlink"/>
+            <w:i/>
+            <w:iCs/>
+          </w:rPr>
+          <w:t>arXiv:2606.06879</w:t>
+        </w:r>
+      </w:hyperlink>
       <w:r>
         <w:rPr>
           <w:i/>
           <w:iCs/>
         </w:rPr>
-        <w:t>arXiv:2606.06879 | IEEE BigData 2026 (Under Review)</w:t>
+        <w:t xml:space="preserve"> | Peer review in progress</w:t>
       </w:r>
     </w:p>
     <w:p>

</xml_diff>